<commit_message>
Update scatter plot grouping, table widths, diagram labels, and analysis data
- Group pre-2006 trials into single "<2006" point in completion year scatter plot
- Show only key year breaks (<2006, 2010, 2015, 2020) to avoid label overlap
- Switch Table 3 to autofit layout for proper margin-to-margin width
- Rename "PubMed query - LLM" to "PubMed query - ChatGPT-5.1" in tool diagram
- Update analysis data and output files

Co-Authored-By: Claude Opus 4.6 <noreply@anthropic.com>
</commit_message>
<xml_diff>
--- a/analysis/out/tables/2c_table3_subgroups.docx
+++ b/analysis/out/tables/2c_table3_subgroups.docx
@@ -38,17 +38,11 @@
     </w:p>
     <w:tbl xmlns:a="http://schemas.openxmlformats.org/drawingml/2006/main" xmlns:pic="http://schemas.openxmlformats.org/drawingml/2006/picture">
       <w:tblPr>
-        <w:tblLayout w:type="fixed"/>
+        <w:tblLayout w:type="autofit"/>
         <w:jc w:val="center"/>
+        <w:tblW w:type="pct" w:w="5000"/>
         <w:tblLook w:firstRow="1" w:lastRow="0" w:firstColumn="0" w:lastColumn="0" w:noHBand="0" w:noVBand="1"/>
       </w:tblPr>
-      <w:tblGrid>
-        <w:gridCol w:w="3024"/>
-        <w:gridCol w:w="2016"/>
-        <w:gridCol w:w="2016"/>
-        <w:gridCol w:w="2016"/>
-        <w:gridCol w:w="720"/>
-      </w:tblGrid>
       <w:tr>
         <w:trPr>
           <w:trHeight w:val="360" w:hRule="auto"/>
@@ -4080,117 +4074,117 @@
                 <w:szCs w:val="18"/>
                 <w:color w:val="000000"/>
               </w:rPr>
-              <w:t xml:space="preserve">4509/6124 (73.6%)</w:t>
-            </w:r>
-          </w:p>
-        </w:tc>
-        <w:tc>
-          <w:tcPr>
-            <w:tcBorders>
-              <w:bottom w:val="none" w:sz="0" w:space="0" w:color="000000"/>
-              <w:top w:val="none" w:sz="0" w:space="0" w:color="000000"/>
-              <w:left w:val="none" w:sz="0" w:space="0" w:color="000000"/>
-              <w:right w:val="none" w:sz="0" w:space="0" w:color="000000"/>
-            </w:tcBorders>
-            <w:shd w:val="clear" w:color="auto" w:fill="FFFFFF"/>
-            <w:tcMar>
-              <w:top w:w="0" w:type="dxa"/>
-              <w:bottom w:w="0" w:type="dxa"/>
-              <w:left w:w="0" w:type="dxa"/>
-              <w:right w:w="0" w:type="dxa"/>
-            </w:tcMar>
-            <w:vAlign w:val="center"/>
-          </w:tcPr>
-          <w:p>
-            <w:pPr>
-              <w:pStyle w:val="Normal"/>
-              <w:jc w:val="center"/>
-              <w:pBdr>
-                <w:bottom w:val="none" w:sz="0" w:space="0" w:color="000000"/>
-                <w:top w:val="none" w:sz="0" w:space="0" w:color="000000"/>
-                <w:left w:val="none" w:sz="0" w:space="0" w:color="000000"/>
-                <w:right w:val="none" w:sz="0" w:space="0" w:color="000000"/>
-              </w:pBdr>
-              <w:spacing w:after="100" w:before="100" w:line="240"/>
-              <w:ind w:left="100" w:right="100" w:firstLine="0" w:firstLineChars="0"/>
-              <w:rPr>
-                <w:rFonts w:ascii="Times New Roman" w:hAnsi="Times New Roman" w:eastAsia="Times New Roman" w:cs="Times New Roman"/>
-                <w:i w:val="false"/>
-                <w:b w:val="false"/>
-                <w:u w:val="none"/>
-                <w:strike w:val="false"/>
-                <w:sz w:val="18"/>
-                <w:szCs w:val="18"/>
-                <w:color w:val="000000"/>
-              </w:rPr>
-            </w:pPr>
-            <w:r>
-              <w:rPr>
-                <w:rFonts w:ascii="Times New Roman" w:hAnsi="Times New Roman" w:eastAsia="Times New Roman" w:cs="Times New Roman"/>
-                <w:i w:val="false"/>
-                <w:b w:val="false"/>
-                <w:u w:val="none"/>
-                <w:strike w:val="false"/>
-                <w:sz w:val="18"/>
-                <w:szCs w:val="18"/>
-                <w:color w:val="000000"/>
-              </w:rPr>
-              <w:t xml:space="preserve">4133/6124 (67.5%)</w:t>
-            </w:r>
-          </w:p>
-        </w:tc>
-        <w:tc>
-          <w:tcPr>
-            <w:tcBorders>
-              <w:bottom w:val="none" w:sz="0" w:space="0" w:color="000000"/>
-              <w:top w:val="none" w:sz="0" w:space="0" w:color="000000"/>
-              <w:left w:val="none" w:sz="0" w:space="0" w:color="000000"/>
-              <w:right w:val="none" w:sz="0" w:space="0" w:color="000000"/>
-            </w:tcBorders>
-            <w:shd w:val="clear" w:color="auto" w:fill="FFFFFF"/>
-            <w:tcMar>
-              <w:top w:w="0" w:type="dxa"/>
-              <w:bottom w:w="0" w:type="dxa"/>
-              <w:left w:w="0" w:type="dxa"/>
-              <w:right w:w="0" w:type="dxa"/>
-            </w:tcMar>
-            <w:vAlign w:val="center"/>
-          </w:tcPr>
-          <w:p>
-            <w:pPr>
-              <w:pStyle w:val="Normal"/>
-              <w:jc w:val="center"/>
-              <w:pBdr>
-                <w:bottom w:val="none" w:sz="0" w:space="0" w:color="000000"/>
-                <w:top w:val="none" w:sz="0" w:space="0" w:color="000000"/>
-                <w:left w:val="none" w:sz="0" w:space="0" w:color="000000"/>
-                <w:right w:val="none" w:sz="0" w:space="0" w:color="000000"/>
-              </w:pBdr>
-              <w:spacing w:after="100" w:before="100" w:line="240"/>
-              <w:ind w:left="100" w:right="100" w:firstLine="0" w:firstLineChars="0"/>
-              <w:rPr>
-                <w:rFonts w:ascii="Times New Roman" w:hAnsi="Times New Roman" w:eastAsia="Times New Roman" w:cs="Times New Roman"/>
-                <w:i w:val="false"/>
-                <w:b w:val="false"/>
-                <w:u w:val="none"/>
-                <w:strike w:val="false"/>
-                <w:sz w:val="18"/>
-                <w:szCs w:val="18"/>
-                <w:color w:val="000000"/>
-              </w:rPr>
-            </w:pPr>
-            <w:r>
-              <w:rPr>
-                <w:rFonts w:ascii="Times New Roman" w:hAnsi="Times New Roman" w:eastAsia="Times New Roman" w:cs="Times New Roman"/>
-                <w:i w:val="false"/>
-                <w:b w:val="false"/>
-                <w:u w:val="none"/>
-                <w:strike w:val="false"/>
-                <w:sz w:val="18"/>
-                <w:szCs w:val="18"/>
-                <w:color w:val="000000"/>
-              </w:rPr>
-              <w:t xml:space="preserve">1272/6124 (20.8%)</w:t>
+              <w:t xml:space="preserve">4504/6116 (73.6%)</w:t>
+            </w:r>
+          </w:p>
+        </w:tc>
+        <w:tc>
+          <w:tcPr>
+            <w:tcBorders>
+              <w:bottom w:val="none" w:sz="0" w:space="0" w:color="000000"/>
+              <w:top w:val="none" w:sz="0" w:space="0" w:color="000000"/>
+              <w:left w:val="none" w:sz="0" w:space="0" w:color="000000"/>
+              <w:right w:val="none" w:sz="0" w:space="0" w:color="000000"/>
+            </w:tcBorders>
+            <w:shd w:val="clear" w:color="auto" w:fill="FFFFFF"/>
+            <w:tcMar>
+              <w:top w:w="0" w:type="dxa"/>
+              <w:bottom w:w="0" w:type="dxa"/>
+              <w:left w:w="0" w:type="dxa"/>
+              <w:right w:w="0" w:type="dxa"/>
+            </w:tcMar>
+            <w:vAlign w:val="center"/>
+          </w:tcPr>
+          <w:p>
+            <w:pPr>
+              <w:pStyle w:val="Normal"/>
+              <w:jc w:val="center"/>
+              <w:pBdr>
+                <w:bottom w:val="none" w:sz="0" w:space="0" w:color="000000"/>
+                <w:top w:val="none" w:sz="0" w:space="0" w:color="000000"/>
+                <w:left w:val="none" w:sz="0" w:space="0" w:color="000000"/>
+                <w:right w:val="none" w:sz="0" w:space="0" w:color="000000"/>
+              </w:pBdr>
+              <w:spacing w:after="100" w:before="100" w:line="240"/>
+              <w:ind w:left="100" w:right="100" w:firstLine="0" w:firstLineChars="0"/>
+              <w:rPr>
+                <w:rFonts w:ascii="Times New Roman" w:hAnsi="Times New Roman" w:eastAsia="Times New Roman" w:cs="Times New Roman"/>
+                <w:i w:val="false"/>
+                <w:b w:val="false"/>
+                <w:u w:val="none"/>
+                <w:strike w:val="false"/>
+                <w:sz w:val="18"/>
+                <w:szCs w:val="18"/>
+                <w:color w:val="000000"/>
+              </w:rPr>
+            </w:pPr>
+            <w:r>
+              <w:rPr>
+                <w:rFonts w:ascii="Times New Roman" w:hAnsi="Times New Roman" w:eastAsia="Times New Roman" w:cs="Times New Roman"/>
+                <w:i w:val="false"/>
+                <w:b w:val="false"/>
+                <w:u w:val="none"/>
+                <w:strike w:val="false"/>
+                <w:sz w:val="18"/>
+                <w:szCs w:val="18"/>
+                <w:color w:val="000000"/>
+              </w:rPr>
+              <w:t xml:space="preserve">4129/6116 (67.5%)</w:t>
+            </w:r>
+          </w:p>
+        </w:tc>
+        <w:tc>
+          <w:tcPr>
+            <w:tcBorders>
+              <w:bottom w:val="none" w:sz="0" w:space="0" w:color="000000"/>
+              <w:top w:val="none" w:sz="0" w:space="0" w:color="000000"/>
+              <w:left w:val="none" w:sz="0" w:space="0" w:color="000000"/>
+              <w:right w:val="none" w:sz="0" w:space="0" w:color="000000"/>
+            </w:tcBorders>
+            <w:shd w:val="clear" w:color="auto" w:fill="FFFFFF"/>
+            <w:tcMar>
+              <w:top w:w="0" w:type="dxa"/>
+              <w:bottom w:w="0" w:type="dxa"/>
+              <w:left w:w="0" w:type="dxa"/>
+              <w:right w:w="0" w:type="dxa"/>
+            </w:tcMar>
+            <w:vAlign w:val="center"/>
+          </w:tcPr>
+          <w:p>
+            <w:pPr>
+              <w:pStyle w:val="Normal"/>
+              <w:jc w:val="center"/>
+              <w:pBdr>
+                <w:bottom w:val="none" w:sz="0" w:space="0" w:color="000000"/>
+                <w:top w:val="none" w:sz="0" w:space="0" w:color="000000"/>
+                <w:left w:val="none" w:sz="0" w:space="0" w:color="000000"/>
+                <w:right w:val="none" w:sz="0" w:space="0" w:color="000000"/>
+              </w:pBdr>
+              <w:spacing w:after="100" w:before="100" w:line="240"/>
+              <w:ind w:left="100" w:right="100" w:firstLine="0" w:firstLineChars="0"/>
+              <w:rPr>
+                <w:rFonts w:ascii="Times New Roman" w:hAnsi="Times New Roman" w:eastAsia="Times New Roman" w:cs="Times New Roman"/>
+                <w:i w:val="false"/>
+                <w:b w:val="false"/>
+                <w:u w:val="none"/>
+                <w:strike w:val="false"/>
+                <w:sz w:val="18"/>
+                <w:szCs w:val="18"/>
+                <w:color w:val="000000"/>
+              </w:rPr>
+            </w:pPr>
+            <w:r>
+              <w:rPr>
+                <w:rFonts w:ascii="Times New Roman" w:hAnsi="Times New Roman" w:eastAsia="Times New Roman" w:cs="Times New Roman"/>
+                <w:i w:val="false"/>
+                <w:b w:val="false"/>
+                <w:u w:val="none"/>
+                <w:strike w:val="false"/>
+                <w:sz w:val="18"/>
+                <w:szCs w:val="18"/>
+                <w:color w:val="000000"/>
+              </w:rPr>
+              <w:t xml:space="preserve">1269/6116 (20.7%)</w:t>
             </w:r>
           </w:p>
         </w:tc>
@@ -4360,117 +4354,117 @@
                 <w:szCs w:val="18"/>
                 <w:color w:val="000000"/>
               </w:rPr>
-              <w:t xml:space="preserve">2194/3112 (70.5%)</w:t>
-            </w:r>
-          </w:p>
-        </w:tc>
-        <w:tc>
-          <w:tcPr>
-            <w:tcBorders>
-              <w:bottom w:val="none" w:sz="0" w:space="0" w:color="000000"/>
-              <w:top w:val="none" w:sz="0" w:space="0" w:color="000000"/>
-              <w:left w:val="none" w:sz="0" w:space="0" w:color="000000"/>
-              <w:right w:val="none" w:sz="0" w:space="0" w:color="000000"/>
-            </w:tcBorders>
-            <w:shd w:val="clear" w:color="auto" w:fill="FFFFFF"/>
-            <w:tcMar>
-              <w:top w:w="0" w:type="dxa"/>
-              <w:bottom w:w="0" w:type="dxa"/>
-              <w:left w:w="0" w:type="dxa"/>
-              <w:right w:w="0" w:type="dxa"/>
-            </w:tcMar>
-            <w:vAlign w:val="center"/>
-          </w:tcPr>
-          <w:p>
-            <w:pPr>
-              <w:pStyle w:val="Normal"/>
-              <w:jc w:val="center"/>
-              <w:pBdr>
-                <w:bottom w:val="none" w:sz="0" w:space="0" w:color="000000"/>
-                <w:top w:val="none" w:sz="0" w:space="0" w:color="000000"/>
-                <w:left w:val="none" w:sz="0" w:space="0" w:color="000000"/>
-                <w:right w:val="none" w:sz="0" w:space="0" w:color="000000"/>
-              </w:pBdr>
-              <w:spacing w:after="100" w:before="100" w:line="240"/>
-              <w:ind w:left="100" w:right="100" w:firstLine="0" w:firstLineChars="0"/>
-              <w:rPr>
-                <w:rFonts w:ascii="Times New Roman" w:hAnsi="Times New Roman" w:eastAsia="Times New Roman" w:cs="Times New Roman"/>
-                <w:i w:val="false"/>
-                <w:b w:val="false"/>
-                <w:u w:val="none"/>
-                <w:strike w:val="false"/>
-                <w:sz w:val="18"/>
-                <w:szCs w:val="18"/>
-                <w:color w:val="000000"/>
-              </w:rPr>
-            </w:pPr>
-            <w:r>
-              <w:rPr>
-                <w:rFonts w:ascii="Times New Roman" w:hAnsi="Times New Roman" w:eastAsia="Times New Roman" w:cs="Times New Roman"/>
-                <w:i w:val="false"/>
-                <w:b w:val="false"/>
-                <w:u w:val="none"/>
-                <w:strike w:val="false"/>
-                <w:sz w:val="18"/>
-                <w:szCs w:val="18"/>
-                <w:color w:val="000000"/>
-              </w:rPr>
-              <w:t xml:space="preserve">1721/3112 (55.3%)</w:t>
-            </w:r>
-          </w:p>
-        </w:tc>
-        <w:tc>
-          <w:tcPr>
-            <w:tcBorders>
-              <w:bottom w:val="none" w:sz="0" w:space="0" w:color="000000"/>
-              <w:top w:val="none" w:sz="0" w:space="0" w:color="000000"/>
-              <w:left w:val="none" w:sz="0" w:space="0" w:color="000000"/>
-              <w:right w:val="none" w:sz="0" w:space="0" w:color="000000"/>
-            </w:tcBorders>
-            <w:shd w:val="clear" w:color="auto" w:fill="FFFFFF"/>
-            <w:tcMar>
-              <w:top w:w="0" w:type="dxa"/>
-              <w:bottom w:w="0" w:type="dxa"/>
-              <w:left w:w="0" w:type="dxa"/>
-              <w:right w:w="0" w:type="dxa"/>
-            </w:tcMar>
-            <w:vAlign w:val="center"/>
-          </w:tcPr>
-          <w:p>
-            <w:pPr>
-              <w:pStyle w:val="Normal"/>
-              <w:jc w:val="center"/>
-              <w:pBdr>
-                <w:bottom w:val="none" w:sz="0" w:space="0" w:color="000000"/>
-                <w:top w:val="none" w:sz="0" w:space="0" w:color="000000"/>
-                <w:left w:val="none" w:sz="0" w:space="0" w:color="000000"/>
-                <w:right w:val="none" w:sz="0" w:space="0" w:color="000000"/>
-              </w:pBdr>
-              <w:spacing w:after="100" w:before="100" w:line="240"/>
-              <w:ind w:left="100" w:right="100" w:firstLine="0" w:firstLineChars="0"/>
-              <w:rPr>
-                <w:rFonts w:ascii="Times New Roman" w:hAnsi="Times New Roman" w:eastAsia="Times New Roman" w:cs="Times New Roman"/>
-                <w:i w:val="false"/>
-                <w:b w:val="false"/>
-                <w:u w:val="none"/>
-                <w:strike w:val="false"/>
-                <w:sz w:val="18"/>
-                <w:szCs w:val="18"/>
-                <w:color w:val="000000"/>
-              </w:rPr>
-            </w:pPr>
-            <w:r>
-              <w:rPr>
-                <w:rFonts w:ascii="Times New Roman" w:hAnsi="Times New Roman" w:eastAsia="Times New Roman" w:cs="Times New Roman"/>
-                <w:i w:val="false"/>
-                <w:b w:val="false"/>
-                <w:u w:val="none"/>
-                <w:strike w:val="false"/>
-                <w:sz w:val="18"/>
-                <w:szCs w:val="18"/>
-                <w:color w:val="000000"/>
-              </w:rPr>
-              <w:t xml:space="preserve">1317/3112 (42.3%)</w:t>
+              <w:t xml:space="preserve">2199/3120 (70.5%)</w:t>
+            </w:r>
+          </w:p>
+        </w:tc>
+        <w:tc>
+          <w:tcPr>
+            <w:tcBorders>
+              <w:bottom w:val="none" w:sz="0" w:space="0" w:color="000000"/>
+              <w:top w:val="none" w:sz="0" w:space="0" w:color="000000"/>
+              <w:left w:val="none" w:sz="0" w:space="0" w:color="000000"/>
+              <w:right w:val="none" w:sz="0" w:space="0" w:color="000000"/>
+            </w:tcBorders>
+            <w:shd w:val="clear" w:color="auto" w:fill="FFFFFF"/>
+            <w:tcMar>
+              <w:top w:w="0" w:type="dxa"/>
+              <w:bottom w:w="0" w:type="dxa"/>
+              <w:left w:w="0" w:type="dxa"/>
+              <w:right w:w="0" w:type="dxa"/>
+            </w:tcMar>
+            <w:vAlign w:val="center"/>
+          </w:tcPr>
+          <w:p>
+            <w:pPr>
+              <w:pStyle w:val="Normal"/>
+              <w:jc w:val="center"/>
+              <w:pBdr>
+                <w:bottom w:val="none" w:sz="0" w:space="0" w:color="000000"/>
+                <w:top w:val="none" w:sz="0" w:space="0" w:color="000000"/>
+                <w:left w:val="none" w:sz="0" w:space="0" w:color="000000"/>
+                <w:right w:val="none" w:sz="0" w:space="0" w:color="000000"/>
+              </w:pBdr>
+              <w:spacing w:after="100" w:before="100" w:line="240"/>
+              <w:ind w:left="100" w:right="100" w:firstLine="0" w:firstLineChars="0"/>
+              <w:rPr>
+                <w:rFonts w:ascii="Times New Roman" w:hAnsi="Times New Roman" w:eastAsia="Times New Roman" w:cs="Times New Roman"/>
+                <w:i w:val="false"/>
+                <w:b w:val="false"/>
+                <w:u w:val="none"/>
+                <w:strike w:val="false"/>
+                <w:sz w:val="18"/>
+                <w:szCs w:val="18"/>
+                <w:color w:val="000000"/>
+              </w:rPr>
+            </w:pPr>
+            <w:r>
+              <w:rPr>
+                <w:rFonts w:ascii="Times New Roman" w:hAnsi="Times New Roman" w:eastAsia="Times New Roman" w:cs="Times New Roman"/>
+                <w:i w:val="false"/>
+                <w:b w:val="false"/>
+                <w:u w:val="none"/>
+                <w:strike w:val="false"/>
+                <w:sz w:val="18"/>
+                <w:szCs w:val="18"/>
+                <w:color w:val="000000"/>
+              </w:rPr>
+              <w:t xml:space="preserve">1725/3120 (55.3%)</w:t>
+            </w:r>
+          </w:p>
+        </w:tc>
+        <w:tc>
+          <w:tcPr>
+            <w:tcBorders>
+              <w:bottom w:val="none" w:sz="0" w:space="0" w:color="000000"/>
+              <w:top w:val="none" w:sz="0" w:space="0" w:color="000000"/>
+              <w:left w:val="none" w:sz="0" w:space="0" w:color="000000"/>
+              <w:right w:val="none" w:sz="0" w:space="0" w:color="000000"/>
+            </w:tcBorders>
+            <w:shd w:val="clear" w:color="auto" w:fill="FFFFFF"/>
+            <w:tcMar>
+              <w:top w:w="0" w:type="dxa"/>
+              <w:bottom w:w="0" w:type="dxa"/>
+              <w:left w:w="0" w:type="dxa"/>
+              <w:right w:w="0" w:type="dxa"/>
+            </w:tcMar>
+            <w:vAlign w:val="center"/>
+          </w:tcPr>
+          <w:p>
+            <w:pPr>
+              <w:pStyle w:val="Normal"/>
+              <w:jc w:val="center"/>
+              <w:pBdr>
+                <w:bottom w:val="none" w:sz="0" w:space="0" w:color="000000"/>
+                <w:top w:val="none" w:sz="0" w:space="0" w:color="000000"/>
+                <w:left w:val="none" w:sz="0" w:space="0" w:color="000000"/>
+                <w:right w:val="none" w:sz="0" w:space="0" w:color="000000"/>
+              </w:pBdr>
+              <w:spacing w:after="100" w:before="100" w:line="240"/>
+              <w:ind w:left="100" w:right="100" w:firstLine="0" w:firstLineChars="0"/>
+              <w:rPr>
+                <w:rFonts w:ascii="Times New Roman" w:hAnsi="Times New Roman" w:eastAsia="Times New Roman" w:cs="Times New Roman"/>
+                <w:i w:val="false"/>
+                <w:b w:val="false"/>
+                <w:u w:val="none"/>
+                <w:strike w:val="false"/>
+                <w:sz w:val="18"/>
+                <w:szCs w:val="18"/>
+                <w:color w:val="000000"/>
+              </w:rPr>
+            </w:pPr>
+            <w:r>
+              <w:rPr>
+                <w:rFonts w:ascii="Times New Roman" w:hAnsi="Times New Roman" w:eastAsia="Times New Roman" w:cs="Times New Roman"/>
+                <w:i w:val="false"/>
+                <w:b w:val="false"/>
+                <w:u w:val="none"/>
+                <w:strike w:val="false"/>
+                <w:sz w:val="18"/>
+                <w:szCs w:val="18"/>
+                <w:color w:val="000000"/>
+              </w:rPr>
+              <w:t xml:space="preserve">1320/3120 (42.3%)</w:t>
             </w:r>
           </w:p>
         </w:tc>

</xml_diff>